<commit_message>
docs: include screenshots in the docx file
</commit_message>
<xml_diff>
--- a/Mailora_Final_Raporu.docx
+++ b/Mailora_Final_Raporu.docx
@@ -99,7 +99,7 @@
         <w:pStyle w:val="ListNumber"/>
       </w:pPr>
       <w:r>
-        <w:t>Resim 1: Kullanıcı Giriş ve Hesap Ekleme Ekranı</w:t>
+        <w:t>Resim 1: Birleşik Gelen Kutusu (Inbox) ve Temel E-posta Arayüzü</w:t>
       </w:r>
     </w:p>
     <w:p>
@@ -107,7 +107,7 @@
         <w:pStyle w:val="ListNumber"/>
       </w:pPr>
       <w:r>
-        <w:t>Resim 2: Birleşik Gelen Kutusu (Unified Inbox) ve Temel E-posta Arayüzü</w:t>
+        <w:t>Resim 2: Yapay Zeka Destekli E-posta Özetleme ve Duygu Analizi Ekranı</w:t>
       </w:r>
     </w:p>
     <w:p>
@@ -115,7 +115,7 @@
         <w:pStyle w:val="ListNumber"/>
       </w:pPr>
       <w:r>
-        <w:t>Resim 3: Yapay Zeka (AI) Özetleme ve Akıllı Cevap Analizi Ekranı</w:t>
+        <w:t>Resim 3: Entegre Tablolar (Sheets) Modülü</w:t>
       </w:r>
     </w:p>
     <w:p>
@@ -123,7 +123,7 @@
         <w:pStyle w:val="ListNumber"/>
       </w:pPr>
       <w:r>
-        <w:t>Resim 4: Performans, Duygu Analizi Grafikleri ve Yönetici (Admin) Paneli</w:t>
+        <w:t>Resim 4: Admin Paneli, Sistem Performans</w:t>
       </w:r>
     </w:p>
     <w:p>

</xml_diff>

<commit_message>
docs: insert TOC fields and explicitly attach images to docx
</commit_message>
<xml_diff>
--- a/Mailora_Final_Raporu.docx
+++ b/Mailora_Final_Raporu.docx
@@ -66,7 +66,18 @@
     </w:p>
     <w:p>
       <w:r>
-        <w:t>(Bu bölüm kelime işlemci programında otomatik oluşturulacaktır)</w:t>
+        <w:fldChar w:fldCharType="begin"/>
+        <w:instrText xml:space="preserve">TOC \o "1-3" \h \z \u</w:instrText>
+        <w:fldChar w:fldCharType="separate"/>
+        <w:fldChar w:fldCharType="end"/>
+      </w:r>
+    </w:p>
+    <w:p>
+      <w:pPr>
+        <w:pStyle w:val="IntenseQuote"/>
+      </w:pPr>
+      <w:r>
+        <w:t>Lütfen belgeyi açtıktan sonra bu alana sağ tıklayıp 'Alanı Güncelle' (Update Field) seçeneğine tıklayın. MS Word içindekileri hemen oluşturacaktır.</w:t>
       </w:r>
     </w:p>
     <w:p>
@@ -81,7 +92,18 @@
     </w:p>
     <w:p>
       <w:r>
-        <w:t>(Bu bölüm kelime işlemci programında otomatik oluşturulacaktır)</w:t>
+        <w:fldChar w:fldCharType="begin"/>
+        <w:instrText xml:space="preserve">TOC \o "1-3" \h \z \u</w:instrText>
+        <w:fldChar w:fldCharType="separate"/>
+        <w:fldChar w:fldCharType="end"/>
+      </w:r>
+    </w:p>
+    <w:p>
+      <w:pPr>
+        <w:pStyle w:val="IntenseQuote"/>
+      </w:pPr>
+      <w:r>
+        <w:t>Lütfen belgeyi açtıktan sonra bu alana sağ tıklayıp 'Alanı Güncelle' (Update Field) seçeneğine tıklayın. MS Word içindekileri hemen oluşturacaktır.</w:t>
       </w:r>
     </w:p>
     <w:p>
@@ -889,6 +911,199 @@
         <w:t>SQLite Consortium. (2025). *SQLite Database Engine Documentation*.</w:t>
       </w:r>
     </w:p>
+    <w:p>
+      <w:r>
+        <w:br w:type="page"/>
+      </w:r>
+    </w:p>
+    <w:p>
+      <w:pPr>
+        <w:pStyle w:val="Heading1"/>
+      </w:pPr>
+      <w:r>
+        <w:t>EKLER: EKRAN GÖRÜNTÜLERİ VE ŞEKİLLER</w:t>
+      </w:r>
+    </w:p>
+    <w:p>
+      <w:r>
+        <w:drawing>
+          <wp:inline xmlns:a="http://schemas.openxmlformats.org/drawingml/2006/main" xmlns:pic="http://schemas.openxmlformats.org/drawingml/2006/picture">
+            <wp:extent cx="5486400" cy="4022769"/>
+            <wp:docPr id="1" name="Picture 1"/>
+            <wp:cNvGraphicFramePr>
+              <a:graphicFrameLocks noChangeAspect="1"/>
+            </wp:cNvGraphicFramePr>
+            <a:graphic>
+              <a:graphicData uri="http://schemas.openxmlformats.org/drawingml/2006/picture">
+                <pic:pic>
+                  <pic:nvPicPr>
+                    <pic:cNvPr id="0" name="AnaSayfa.jpeg"/>
+                    <pic:cNvPicPr/>
+                  </pic:nvPicPr>
+                  <pic:blipFill>
+                    <a:blip r:embed="rId9"/>
+                    <a:stretch>
+                      <a:fillRect/>
+                    </a:stretch>
+                  </pic:blipFill>
+                  <pic:spPr>
+                    <a:xfrm>
+                      <a:off x="0" y="0"/>
+                      <a:ext cx="5486400" cy="4022769"/>
+                    </a:xfrm>
+                    <a:prstGeom prst="rect"/>
+                  </pic:spPr>
+                </pic:pic>
+              </a:graphicData>
+            </a:graphic>
+          </wp:inline>
+        </w:drawing>
+      </w:r>
+    </w:p>
+    <w:p>
+      <w:pPr>
+        <w:pStyle w:val="Caption"/>
+      </w:pPr>
+      <w:r>
+        <w:t>Şekil 1: Birleşik Gelen Kutusu (Inbox) ve Temel E-posta Arayüzü</w:t>
+      </w:r>
+    </w:p>
+    <w:p/>
+    <w:p>
+      <w:r>
+        <w:drawing>
+          <wp:inline xmlns:a="http://schemas.openxmlformats.org/drawingml/2006/main" xmlns:pic="http://schemas.openxmlformats.org/drawingml/2006/picture">
+            <wp:extent cx="5486400" cy="2960016"/>
+            <wp:docPr id="2" name="Picture 2"/>
+            <wp:cNvGraphicFramePr>
+              <a:graphicFrameLocks noChangeAspect="1"/>
+            </wp:cNvGraphicFramePr>
+            <a:graphic>
+              <a:graphicData uri="http://schemas.openxmlformats.org/drawingml/2006/picture">
+                <pic:pic>
+                  <pic:nvPicPr>
+                    <pic:cNvPr id="0" name="Ceviri.jpeg"/>
+                    <pic:cNvPicPr/>
+                  </pic:nvPicPr>
+                  <pic:blipFill>
+                    <a:blip r:embed="rId10"/>
+                    <a:stretch>
+                      <a:fillRect/>
+                    </a:stretch>
+                  </pic:blipFill>
+                  <pic:spPr>
+                    <a:xfrm>
+                      <a:off x="0" y="0"/>
+                      <a:ext cx="5486400" cy="2960016"/>
+                    </a:xfrm>
+                    <a:prstGeom prst="rect"/>
+                  </pic:spPr>
+                </pic:pic>
+              </a:graphicData>
+            </a:graphic>
+          </wp:inline>
+        </w:drawing>
+      </w:r>
+    </w:p>
+    <w:p>
+      <w:pPr>
+        <w:pStyle w:val="Caption"/>
+      </w:pPr>
+      <w:r>
+        <w:t>Şekil 2: Yapay Zeka Destekli E-posta Özetleme ve Duygu Analizi Ekranı</w:t>
+      </w:r>
+    </w:p>
+    <w:p/>
+    <w:p>
+      <w:r>
+        <w:drawing>
+          <wp:inline xmlns:a="http://schemas.openxmlformats.org/drawingml/2006/main" xmlns:pic="http://schemas.openxmlformats.org/drawingml/2006/picture">
+            <wp:extent cx="5486400" cy="2633472"/>
+            <wp:docPr id="3" name="Picture 3"/>
+            <wp:cNvGraphicFramePr>
+              <a:graphicFrameLocks noChangeAspect="1"/>
+            </wp:cNvGraphicFramePr>
+            <a:graphic>
+              <a:graphicData uri="http://schemas.openxmlformats.org/drawingml/2006/picture">
+                <pic:pic>
+                  <pic:nvPicPr>
+                    <pic:cNvPr id="0" name="Tablolar.jpeg"/>
+                    <pic:cNvPicPr/>
+                  </pic:nvPicPr>
+                  <pic:blipFill>
+                    <a:blip r:embed="rId11"/>
+                    <a:stretch>
+                      <a:fillRect/>
+                    </a:stretch>
+                  </pic:blipFill>
+                  <pic:spPr>
+                    <a:xfrm>
+                      <a:off x="0" y="0"/>
+                      <a:ext cx="5486400" cy="2633472"/>
+                    </a:xfrm>
+                    <a:prstGeom prst="rect"/>
+                  </pic:spPr>
+                </pic:pic>
+              </a:graphicData>
+            </a:graphic>
+          </wp:inline>
+        </w:drawing>
+      </w:r>
+    </w:p>
+    <w:p>
+      <w:pPr>
+        <w:pStyle w:val="Caption"/>
+      </w:pPr>
+      <w:r>
+        <w:t>Şekil 3: Entegre Tablolar (Sheets) Modülü</w:t>
+      </w:r>
+    </w:p>
+    <w:p/>
+    <w:p>
+      <w:r>
+        <w:drawing>
+          <wp:inline xmlns:a="http://schemas.openxmlformats.org/drawingml/2006/main" xmlns:pic="http://schemas.openxmlformats.org/drawingml/2006/picture">
+            <wp:extent cx="5486400" cy="3545440"/>
+            <wp:docPr id="4" name="Picture 4"/>
+            <wp:cNvGraphicFramePr>
+              <a:graphicFrameLocks noChangeAspect="1"/>
+            </wp:cNvGraphicFramePr>
+            <a:graphic>
+              <a:graphicData uri="http://schemas.openxmlformats.org/drawingml/2006/picture">
+                <pic:pic>
+                  <pic:nvPicPr>
+                    <pic:cNvPr id="0" name="AdminPaneli.jpeg"/>
+                    <pic:cNvPicPr/>
+                  </pic:nvPicPr>
+                  <pic:blipFill>
+                    <a:blip r:embed="rId12"/>
+                    <a:stretch>
+                      <a:fillRect/>
+                    </a:stretch>
+                  </pic:blipFill>
+                  <pic:spPr>
+                    <a:xfrm>
+                      <a:off x="0" y="0"/>
+                      <a:ext cx="5486400" cy="3545440"/>
+                    </a:xfrm>
+                    <a:prstGeom prst="rect"/>
+                  </pic:spPr>
+                </pic:pic>
+              </a:graphicData>
+            </a:graphic>
+          </wp:inline>
+        </w:drawing>
+      </w:r>
+    </w:p>
+    <w:p>
+      <w:pPr>
+        <w:pStyle w:val="Caption"/>
+      </w:pPr>
+      <w:r>
+        <w:t>Şekil 4: Admin Paneli, Sistem Performansı ve RBAC Yetkilendirme</w:t>
+      </w:r>
+    </w:p>
+    <w:p/>
     <w:sectPr>
       <w:pgSz w:w="12240" w:h="15840"/>
       <w:pgMar w:top="1440" w:right="1800" w:bottom="1440" w:left="1800" w:header="720" w:footer="720" w:gutter="0"/>

</xml_diff>

<commit_message>
fix: insert proper SEQ fields for Table of Figures compatibility in ONLYOFFICE
</commit_message>
<xml_diff>
--- a/Mailora_Final_Raporu.docx
+++ b/Mailora_Final_Raporu.docx
@@ -77,7 +77,7 @@
         <w:pStyle w:val="IntenseQuote"/>
       </w:pPr>
       <w:r>
-        <w:t>Lütfen belgeyi açtıktan sonra bu alana sağ tıklayıp 'Alanı Güncelle' (Update Field) seçeneğine tıklayın. MS Word içindekileri hemen oluşturacaktır.</w:t>
+        <w:t>Lütfen belgeyi açtıktan sonra bu alana sağ tıklayıp 'Alanı Güncelle' seçeneğine tıklayın.</w:t>
       </w:r>
     </w:p>
     <w:p>
@@ -103,7 +103,7 @@
         <w:pStyle w:val="IntenseQuote"/>
       </w:pPr>
       <w:r>
-        <w:t>Lütfen belgeyi açtıktan sonra bu alana sağ tıklayıp 'Alanı Güncelle' (Update Field) seçeneğine tıklayın. MS Word içindekileri hemen oluşturacaktır.</w:t>
+        <w:t>Lütfen belgeyi açtıktan sonra bu alana sağ tıklayıp 'Alanı Güncelle' seçeneğine tıklayın.</w:t>
       </w:r>
     </w:p>
     <w:p>
@@ -115,38 +115,6 @@
         <w:t>Resim Listesi</w:t>
       </w:r>
       <w:r/>
-    </w:p>
-    <w:p>
-      <w:pPr>
-        <w:pStyle w:val="ListNumber"/>
-      </w:pPr>
-      <w:r>
-        <w:t>Resim 1: Birleşik Gelen Kutusu (Inbox) ve Temel E-posta Arayüzü</w:t>
-      </w:r>
-    </w:p>
-    <w:p>
-      <w:pPr>
-        <w:pStyle w:val="ListNumber"/>
-      </w:pPr>
-      <w:r>
-        <w:t>Resim 2: Yapay Zeka Destekli E-posta Özetleme ve Duygu Analizi Ekranı</w:t>
-      </w:r>
-    </w:p>
-    <w:p>
-      <w:pPr>
-        <w:pStyle w:val="ListNumber"/>
-      </w:pPr>
-      <w:r>
-        <w:t>Resim 3: Entegre Tablolar (Sheets) Modülü</w:t>
-      </w:r>
-    </w:p>
-    <w:p>
-      <w:pPr>
-        <w:pStyle w:val="ListNumber"/>
-      </w:pPr>
-      <w:r>
-        <w:t>Resim 4: Admin Paneli, Sistem Performans</w:t>
-      </w:r>
     </w:p>
     <w:p>
       <w:r/>
@@ -965,7 +933,23 @@
         <w:pStyle w:val="Caption"/>
       </w:pPr>
       <w:r>
-        <w:t>Şekil 1: Birleşik Gelen Kutusu (Inbox) ve Temel E-posta Arayüzü</w:t>
+        <w:rPr>
+          <w:b/>
+        </w:rPr>
+        <w:t xml:space="preserve">Şekil </w:t>
+      </w:r>
+      <w:r>
+        <w:rPr>
+          <w:b/>
+        </w:rPr>
+        <w:fldChar w:fldCharType="begin"/>
+        <w:instrText xml:space="preserve"> SEQ Figure \* ARABIC </w:instrText>
+        <w:fldChar w:fldCharType="separate"/>
+        <w:t>1</w:t>
+        <w:fldChar w:fldCharType="end"/>
+      </w:r>
+      <w:r>
+        <w:t>: Birleşik Gelen Kutusu (Inbox) ve Temel E-posta Arayüzü</w:t>
       </w:r>
     </w:p>
     <w:p/>
@@ -1010,7 +994,23 @@
         <w:pStyle w:val="Caption"/>
       </w:pPr>
       <w:r>
-        <w:t>Şekil 2: Yapay Zeka Destekli E-posta Özetleme ve Duygu Analizi Ekranı</w:t>
+        <w:rPr>
+          <w:b/>
+        </w:rPr>
+        <w:t xml:space="preserve">Şekil </w:t>
+      </w:r>
+      <w:r>
+        <w:rPr>
+          <w:b/>
+        </w:rPr>
+        <w:fldChar w:fldCharType="begin"/>
+        <w:instrText xml:space="preserve"> SEQ Figure \* ARABIC </w:instrText>
+        <w:fldChar w:fldCharType="separate"/>
+        <w:t>2</w:t>
+        <w:fldChar w:fldCharType="end"/>
+      </w:r>
+      <w:r>
+        <w:t>: Yapay Zeka Destekli E-posta Özetleme ve Duygu Analizi Ekranı</w:t>
       </w:r>
     </w:p>
     <w:p/>
@@ -1055,7 +1055,23 @@
         <w:pStyle w:val="Caption"/>
       </w:pPr>
       <w:r>
-        <w:t>Şekil 3: Entegre Tablolar (Sheets) Modülü</w:t>
+        <w:rPr>
+          <w:b/>
+        </w:rPr>
+        <w:t xml:space="preserve">Şekil </w:t>
+      </w:r>
+      <w:r>
+        <w:rPr>
+          <w:b/>
+        </w:rPr>
+        <w:fldChar w:fldCharType="begin"/>
+        <w:instrText xml:space="preserve"> SEQ Figure \* ARABIC </w:instrText>
+        <w:fldChar w:fldCharType="separate"/>
+        <w:t>3</w:t>
+        <w:fldChar w:fldCharType="end"/>
+      </w:r>
+      <w:r>
+        <w:t>: Entegre Tablolar (Sheets) Modülü</w:t>
       </w:r>
     </w:p>
     <w:p/>
@@ -1100,7 +1116,23 @@
         <w:pStyle w:val="Caption"/>
       </w:pPr>
       <w:r>
-        <w:t>Şekil 4: Admin Paneli, Sistem Performansı ve RBAC Yetkilendirme</w:t>
+        <w:rPr>
+          <w:b/>
+        </w:rPr>
+        <w:t xml:space="preserve">Şekil </w:t>
+      </w:r>
+      <w:r>
+        <w:rPr>
+          <w:b/>
+        </w:rPr>
+        <w:fldChar w:fldCharType="begin"/>
+        <w:instrText xml:space="preserve"> SEQ Figure \* ARABIC </w:instrText>
+        <w:fldChar w:fldCharType="separate"/>
+        <w:t>4</w:t>
+        <w:fldChar w:fldCharType="end"/>
+      </w:r>
+      <w:r>
+        <w:t>: Admin Paneli, Sistem Performansı ve RBAC Yetkilendirme</w:t>
       </w:r>
     </w:p>
     <w:p/>

</xml_diff>

<commit_message>
docs: correct work breakdown assignments for Cenk and Emirhan
</commit_message>
<xml_diff>
--- a/Mailora_Final_Raporu.docx
+++ b/Mailora_Final_Raporu.docx
@@ -560,7 +560,7 @@
         <w:t>Cenk Orfa (Takım Kaptanı):</w:t>
       </w:r>
       <w:r>
-        <w:t xml:space="preserve"> Backend (Rust/Axum) sistem mimarisi, IMAP/SMTP asenkron ağ katmanı yönetimi, Python yapay zeka model entegrasyonu ve proje veri senkronizasyonu.</w:t>
+        <w:t xml:space="preserve"> Backend (Rust/Axum) sistem mimarisi, IMAP/SMTP asenkron ağ katmanı yönetimi, SQLite veritabanı şema kurgusu ve proje veri senkronizasyonu dahil olmak üzere arka plan ve veritabanına dair tüm altyapı kodlamaları.</w:t>
       </w:r>
     </w:p>
     <w:p>
@@ -575,7 +575,7 @@
         <w:t>Emirhan Yavuz:</w:t>
       </w:r>
       <w:r>
-        <w:t xml:space="preserve"> Frontend arayüz tasarımı, Vanilla JS etkileşimleri, "Tablolar" ve "Takvim" modüllerinin inşası, SQLite veritabanı şema kurgusu ve RBAC paneli entegrasyonu.</w:t>
+        <w:t xml:space="preserve"> Frontend arayüz tasarımı, Vanilla JS etkileşimleri, "Tablolar" ve "Takvim" modüllerinin inşası, RBAC paneli entegrasyonu ve Python yapay zeka model (AI) entegrasyonu.</w:t>
       </w:r>
     </w:p>
     <w:p>

</xml_diff>

<commit_message>
docs: move RBAC authorization assignment to Cenk
</commit_message>
<xml_diff>
--- a/Mailora_Final_Raporu.docx
+++ b/Mailora_Final_Raporu.docx
@@ -560,7 +560,7 @@
         <w:t>Cenk Orfa (Takım Kaptanı):</w:t>
       </w:r>
       <w:r>
-        <w:t xml:space="preserve"> Backend (Rust/Axum) sistem mimarisi, IMAP/SMTP asenkron ağ katmanı yönetimi, SQLite veritabanı şema kurgusu ve proje veri senkronizasyonu dahil olmak üzere arka plan ve veritabanına dair tüm altyapı kodlamaları.</w:t>
+        <w:t xml:space="preserve"> Backend (Rust/Axum) sistem mimarisi, IMAP/SMTP asenkron ağ katmanı yönetimi, SQLite veritabanı şema kurgusu, RBAC (Rol Tabanlı Erişim) yetkilendirme mimarisi ve proje veri senkronizasyonu dahil olmak üzere arka plan ve veritabanına dair tüm altyapı kodlamaları.</w:t>
       </w:r>
     </w:p>
     <w:p>
@@ -575,7 +575,7 @@
         <w:t>Emirhan Yavuz:</w:t>
       </w:r>
       <w:r>
-        <w:t xml:space="preserve"> Frontend arayüz tasarımı, Vanilla JS etkileşimleri, "Tablolar" ve "Takvim" modüllerinin inşası, RBAC paneli entegrasyonu ve Python yapay zeka model (AI) entegrasyonu.</w:t>
+        <w:t xml:space="preserve"> Frontend arayüz tasarımı, Vanilla JS etkileşimleri, "Tablolar" ve "Takvim" modüllerinin inşası ve Python yapay zeka model (AI) entegrasyonu.</w:t>
       </w:r>
     </w:p>
     <w:p>

</xml_diff>

<commit_message>
docs: move FTS5 and Outbox to completed features section
</commit_message>
<xml_diff>
--- a/Mailora_Final_Raporu.docx
+++ b/Mailora_Final_Raporu.docx
@@ -815,12 +815,12 @@
     </w:p>
     <w:p>
       <w:r>
-        <w:t>Elde edilen sonuçlar, "bulut şirketlerine veri sızdırmadan çalışan yapay zeka destekli yerel iletişim istemcisi" vizyonunun pratikte uygulanabilir olduğunu açıkça ortaya koymuştur. Mailora, IMAP sunucularından çektiği verileri internete ihtiyaç duymadan (sadece localhost üzerinde) özetleyebilmiş ve analiz edebilmiştir. Rust programlama dilinin seçimi, ağ yoğunluğu yaşandığı durumlarda düşük sistem tüketimi vaadini yerine getirmiştir.</w:t>
+        <w:t>Elde edilen sonuçlar, "bulut şirketlerine veri sızdırmadan çalışan yapay zeka destekli yerel iletişim istemcisi" vizyonunun pratikte uygulanabilir olduğunu açıkça ortaya koymuştur. Mailora, IMAP sunucularından çektiği verileri internete ihtiyaç duymadan (sadece localhost üzerinde) özetleyebilmiş ve analiz edebilmiştir. Rust programlama dilinin seçimi, ağ yoğunluğu yaşandığı durumlarda düşük sistem tüketimi vaadini yerine getirmiştir. Ayrıca proje dahilinde SQLite FTS5 modülü devreye alınarak binlerce veri içinde saliselerle Full-Text arama yapılabilmiş ve ağ kesintilerine karşı e-postaları bekletip tekrar gönderen "Kalıcı Kuyruk (Outbox)" sistemi başarıyla entegre edilmiştir.</w:t>
       </w:r>
     </w:p>
     <w:p>
       <w:r>
-        <w:t>Gelecek çalışmalar (vizyon) kapsamında; SQLite FTS5 modülü aracılığıyla binlerce veri içinde saliselerle arama (Full-Text Search) yapabilen motorun devreye alınması, ağ kesintilerine karşı mailleri bekletip tekrar gönderen "Kalıcı Kuyruk (Outbox)" sisteminin olgunlaştırılması ve AI modellerinin C/C++ tabanlı GGUF formatına küçültülerek çok daha düşük donanımlı eski ofis bilgisayarlarında da sorunsuz çalıştırılabilmesi planlanmaktadır.</w:t>
+        <w:t>Gelecek çalışmalar (vizyon) kapsamında; projede kullanılan yüksek boyutlu AI modellerinin C/C++ tabanlı GGUF formatına küçültülerek çok daha düşük donanımlı eski ofis bilgisayarlarında da sorunsuz çalıştırılabilmesi ve donanım bağımlılığının en aza indirilmesi planlanmaktadır.</w:t>
       </w:r>
     </w:p>
     <w:p>

</xml_diff>

<commit_message>
docs: align AI usage declaration strictly with university template
</commit_message>
<xml_diff>
--- a/Mailora_Final_Raporu.docx
+++ b/Mailora_Final_Raporu.docx
@@ -502,7 +502,53 @@
     </w:p>
     <w:p>
       <w:r>
-        <w:t>Projenin geliştirme sürecinde etik ve şeffaf bir yapay zeka politikası izlenmiştir:</w:t>
+        <w:t>Bu bölümde proje sürecinde yararlanılan yapay zeka (YZ) araçları, kullanım amaçları ve çıktıların nasıl işlendiği şeffaf biçimde beyan edilmektedir.</w:t>
+      </w:r>
+    </w:p>
+    <w:p>
+      <w:pPr>
+        <w:pStyle w:val="Heading4"/>
+      </w:pPr>
+      <w:r>
+        <w:t>3.1.a Kullanılan YZ Araçları</w:t>
+      </w:r>
+    </w:p>
+    <w:p>
+      <w:pPr>
+        <w:pStyle w:val="ListBullet"/>
+      </w:pPr>
+      <w:r/>
+      <w:r>
+        <w:rPr>
+          <w:b/>
+        </w:rPr>
+        <w:t>ChatGPT / Claude:</w:t>
+      </w:r>
+      <w:r>
+        <w:t xml:space="preserve"> Rust dilindeki borrow-checker (bellek yönetimi) hatalarının tespiti, asenkron IMAP/SMTP ağ katmanı yapılarının tasarlanması ve rapor içerisindeki metinsel düzenlemelerin yapılması.</w:t>
+      </w:r>
+    </w:p>
+    <w:p>
+      <w:pPr>
+        <w:pStyle w:val="ListBullet"/>
+      </w:pPr>
+      <w:r/>
+      <w:r>
+        <w:rPr>
+          <w:b/>
+        </w:rPr>
+        <w:t>Google DeepMind Antigravity (Kod Asistanı):</w:t>
+      </w:r>
+      <w:r>
+        <w:t xml:space="preserve"> Veritabanı şema kurgularının (SQLite) analiz edilmesi, Vanilla JS arayüz bileşenlerindeki hataların ayıklanması, kod optimizasyonları ve RBAC entegrasyonu süreçlerinde asistanlık.</w:t>
+      </w:r>
+    </w:p>
+    <w:p>
+      <w:pPr>
+        <w:pStyle w:val="Heading4"/>
+      </w:pPr>
+      <w:r>
+        <w:t>3.1.b Kullanım Amacı ve Kapsamı</w:t>
       </w:r>
     </w:p>
     <w:p>
@@ -517,7 +563,7 @@
         <w:t>Kod Geliştirme:</w:t>
       </w:r>
       <w:r>
-        <w:t xml:space="preserve"> Rust mimarisindeki derleme (borrow-checker) hatalarının çözümü ve arayüz bileşenlerinin (Örn: Tablolar ızgara sistemi) prototiplenmesi süreçlerinde yapay zeka kod asistanlarından mentörlük alınmış ve kodlar projeye özelleştirilerek entegre edilmiştir.</w:t>
+        <w:t xml:space="preserve"> Yapay zeka, uçtan uca uygulama akışında Rust mimarisinin derleme sürelerini hızlandırmak, SQLx veritabanı sorgularını optimize etmek ve asenkron ağ işlemlerindeki darboğazları (Thread bloklanmaları) gidermek amacıyla kullanıldı.</w:t>
       </w:r>
     </w:p>
     <w:p>
@@ -529,10 +575,182 @@
         <w:rPr>
           <w:b/>
         </w:rPr>
-        <w:t>Proje Altyapısı Olarak YZ:</w:t>
+        <w:t>Hata Ayıklama:</w:t>
       </w:r>
       <w:r>
-        <w:t xml:space="preserve"> Sistemin temel özelliklerinden biri olan yerel metin özetleme, çeviri ve duygu analizi işlemleri için Naive Bayes, SVM algoritmaları ve açık kaynaklı HuggingFace modelleri projeye manuel olarak yerleştirilmiştir.</w:t>
+        <w:t xml:space="preserve"> Özellikle eski e-posta sunucularından gelen sorunlu karakter setlerinin (Mojibake) ayrıştırılması aşamasında algoritma desteği alındı.</w:t>
+      </w:r>
+    </w:p>
+    <w:p>
+      <w:pPr>
+        <w:pStyle w:val="Heading4"/>
+      </w:pPr>
+      <w:r>
+        <w:t>3.1.c Çıktıların Doğrulanması ve Düzenlenmesi</w:t>
+      </w:r>
+    </w:p>
+    <w:p>
+      <w:r>
+        <w:t>Proje geliştirme sürecimizde, uygulamanın akıllı yeteneklerini (e-posta özetleme, duygu analizi) oluşturmak amacıyla Python tabanlı açık kaynaklı NLP modelleri projeye manuel olarak entegre edilmiştir. Kod üretimi için kullanılan YZ asistanlarından (ChatGPT, Claude, vb.) alınan her türlü asenkron Rust mimarisi çıktısı, uygulamanın bellek güvenliği (memory safety) standartlarına ve SQLite ilişkisel veritabanı kısıtlamalarına uygunluk açısından denetlenerek projeye dahil edilmiştir.</w:t>
+      </w:r>
+    </w:p>
+    <w:p>
+      <w:pPr>
+        <w:pStyle w:val="Heading4"/>
+      </w:pPr>
+      <w:r>
+        <w:t>3.1.d YZ Çıktıları Ekip Üyeleri Tarafından Nasıl İncelendi ve Test Edildi?</w:t>
+      </w:r>
+    </w:p>
+    <w:p>
+      <w:r>
+        <w:t>YZ tarafından üretilen kod blokları ve mimari öneriler doğrudan ana projeye (main branch) aktarılmamıştır. Üretilen her çıktı;</w:t>
+      </w:r>
+    </w:p>
+    <w:p>
+      <w:pPr>
+        <w:pStyle w:val="ListNumber"/>
+      </w:pPr>
+      <w:r/>
+      <w:r>
+        <w:rPr>
+          <w:b/>
+        </w:rPr>
+        <w:t>Mimari Uygunluk Kontrolü:</w:t>
+      </w:r>
+      <w:r>
+        <w:t xml:space="preserve"> Uygulamanın benimsediği "Local-First" ve "Güvenli Rust" (Safe Rust) standartlarına uyup uymadığı gözden geçirilmiştir.</w:t>
+      </w:r>
+    </w:p>
+    <w:p>
+      <w:pPr>
+        <w:pStyle w:val="ListNumber"/>
+      </w:pPr>
+      <w:r/>
+      <w:r>
+        <w:rPr>
+          <w:b/>
+        </w:rPr>
+        <w:t>Korumalı Alan Testleri:</w:t>
+      </w:r>
+      <w:r>
+        <w:t xml:space="preserve"> Ağ kopması durumlarında asenkron Tokio thread'lerinin kilitlenip kilitlenmediği "Devre Kesici (Circuit Breaker)" ile yerel ortamda test edilmiş, IMAP UID senkronizasyon eşleşmeleri loglanarak manuel doğrulanmıştır.</w:t>
+      </w:r>
+    </w:p>
+    <w:p>
+      <w:pPr>
+        <w:pStyle w:val="ListNumber"/>
+      </w:pPr>
+      <w:r/>
+      <w:r>
+        <w:rPr>
+          <w:b/>
+        </w:rPr>
+        <w:t>Güvenlik İncelemesi:</w:t>
+      </w:r>
+      <w:r>
+        <w:t xml:space="preserve"> YZ'nin ürettiği kodlardaki SQL sorguları (Injection risklerine karşı) denetlenmiş, yetkilendirme (RBAC) mimarisinde açık olmaması için baştan yapılandırılmıştır.</w:t>
+      </w:r>
+    </w:p>
+    <w:p>
+      <w:r/>
+      <w:r>
+        <w:rPr>
+          <w:b/>
+        </w:rPr>
+        <w:t>Hatalı veya Uygunsuz Bulunan Çıktılara Örnekler:</w:t>
+      </w:r>
+      <w:r/>
+    </w:p>
+    <w:p>
+      <w:pPr>
+        <w:pStyle w:val="ListBullet"/>
+      </w:pPr>
+      <w:r/>
+      <w:r>
+        <w:rPr>
+          <w:b/>
+        </w:rPr>
+        <w:t>Gmail UID Gecikmesi Hatası:</w:t>
+      </w:r>
+      <w:r>
+        <w:t xml:space="preserve"> YZ, gönderilen iletilerin doğrudan "Sent" klasöründe anında bulunabileceğini varsayan basit bir kod üretmiş, ancak Gmail'in senkronizasyon gecikmesi nedeniyle sistem UID bulamayarak çökmüştür. *Düzeltme:* YZ'nin basit senaryosu reddedilerek, yerine 60 saniyelik "Backoff-Retry" (Geri Çekilme ve Deneme) kuyruk algoritması manuel olarak yazılmış ve entegre edilmiştir.</w:t>
+      </w:r>
+    </w:p>
+    <w:p>
+      <w:pPr>
+        <w:pStyle w:val="Heading4"/>
+      </w:pPr>
+      <w:r>
+        <w:t>3.1.e YZ Çıktısının Doğrudan Kullanılıp Kullanılmadığı Yoksa Uyarlanıp Uyarlanmadığı</w:t>
+      </w:r>
+    </w:p>
+    <w:p>
+      <w:r>
+        <w:t>Yapay zeka çıktıları, özellikle angarya (boilerplate) kodların yazımı ve tekrarlayan CSS/HTML yapılarının kurgulanması gibi işlemlerde doğrudan kullanılmıştır. Ancak;</w:t>
+      </w:r>
+    </w:p>
+    <w:p>
+      <w:pPr>
+        <w:pStyle w:val="ListBullet"/>
+      </w:pPr>
+      <w:r>
+        <w:t>IMAP/SMTP doğrudan bağlantı noktaları ve asenkron soket yönetimi,</w:t>
+      </w:r>
+    </w:p>
+    <w:p>
+      <w:pPr>
+        <w:pStyle w:val="ListBullet"/>
+      </w:pPr>
+      <w:r>
+        <w:t>Vanilla JS ile yazılan "Tablolar" modülünün ızgara, formül algoritmaları ve Takvim kurgusu,</w:t>
+      </w:r>
+    </w:p>
+    <w:p>
+      <w:pPr>
+        <w:pStyle w:val="ListBullet"/>
+      </w:pPr>
+      <w:r>
+        <w:t>Rol Tabanlı Erişim (RBAC) panelinin güvenlik kısıtlamaları,</w:t>
+      </w:r>
+    </w:p>
+    <w:p>
+      <w:r>
+        <w:t>tamamen proje ekibi tarafından uyarlanmış ve manuel olarak yeniden yapılandırılmıştır. YZ, geliştirmeyi hızlandıran bir mentor (Pair Programmer) olarak konumlandırılmıştır.</w:t>
+      </w:r>
+    </w:p>
+    <w:p>
+      <w:pPr>
+        <w:pStyle w:val="Heading4"/>
+      </w:pPr>
+      <w:r>
+        <w:t>3.1.f Etik Beyan ve Sorumluluk Notu</w:t>
+      </w:r>
+    </w:p>
+    <w:p>
+      <w:r>
+        <w:t>Bu raporda yer alan tüm çalışmalar, yukarıda belirtilen YZ araçlarının yardımıyla kısmen desteklenmiş olmakla birlikte; nihai kararlar, değerlendirmeler ve sorumluluk tamamen grup üyelerine aittir. YZ araçlarından elde edilen çıktılar doğrulanmış, gerektiğinde düzeltilmiş ve projeye bilinçli biçimde entegre edilmiştir. Akademik dürüstlük ilkelerine uyulmuş; YZ kullanımı gizlenmemiş ve şeffaf biçimde beyan edilmiştir.</w:t>
+      </w:r>
+    </w:p>
+    <w:p>
+      <w:r>
+        <w:t>Grup Üyelerinin Onayı:</w:t>
+      </w:r>
+    </w:p>
+    <w:p>
+      <w:pPr>
+        <w:pStyle w:val="ListNumber"/>
+      </w:pPr>
+      <w:r>
+        <w:t>Cenk Orfa - Tarih: ............. - İmza: .............</w:t>
+      </w:r>
+    </w:p>
+    <w:p>
+      <w:pPr>
+        <w:pStyle w:val="ListNumber"/>
+      </w:pPr>
+      <w:r>
+        <w:t>Emirhan Yavuz - Tarih: ............. - İmza: .............</w:t>
       </w:r>
     </w:p>
     <w:p>

</xml_diff>

<commit_message>
docs: emphasize that AI is only a typist and architecture is human-controlled
</commit_message>
<xml_diff>
--- a/Mailora_Final_Raporu.docx
+++ b/Mailora_Final_Raporu.docx
@@ -522,7 +522,7 @@
         <w:rPr>
           <w:b/>
         </w:rPr>
-        <w:t>ChatGPT / Claude:</w:t>
+        <w:t>Gemini / Claude:</w:t>
       </w:r>
       <w:r>
         <w:t xml:space="preserve"> Rust dilindeki borrow-checker (bellek yönetimi) hatalarının tespiti, asenkron IMAP/SMTP ağ katmanı yapılarının tasarlanması ve rapor içerisindeki metinsel düzenlemelerin yapılması.</w:t>
@@ -537,7 +537,7 @@
         <w:rPr>
           <w:b/>
         </w:rPr>
-        <w:t>Google DeepMind Antigravity (Kod Asistanı):</w:t>
+        <w:t>Google Antigravity (Kod Asistanı):</w:t>
       </w:r>
       <w:r>
         <w:t xml:space="preserve"> Veritabanı şema kurgularının (SQLite) analiz edilmesi, Vanilla JS arayüz bileşenlerindeki hataların ayıklanması, kod optimizasyonları ve RBAC entegrasyonu süreçlerinde asistanlık.</w:t>
@@ -560,10 +560,10 @@
         <w:rPr>
           <w:b/>
         </w:rPr>
-        <w:t>Kod Geliştirme:</w:t>
+        <w:t>Kod Yazımı (Uygulama Değil, Amelelik):</w:t>
       </w:r>
       <w:r>
-        <w:t xml:space="preserve"> Yapay zeka, uçtan uca uygulama akışında Rust mimarisinin derleme sürelerini hızlandırmak, SQLx veritabanı sorgularını optimize etmek ve asenkron ağ işlemlerindeki darboğazları (Thread bloklanmaları) gidermek amacıyla kullanıldı.</w:t>
+        <w:t xml:space="preserve"> YZ araçları hiçbir aşamada projenin ana mimarisini veya iş mantığını kendi başına kurmamıştır. Sistemin tasarımı, veritabanı ilişkileri ve genel kontrol mekanizmaları tamamen proje ekibi tarafından planlanmıştır. Yapay zeka, yalnızca ekibin tasarladığı bu mimarinin kod satırlarına dökülmesi ve derleme (borrow-checker) hatalarının hızlıca çözülmesi aşamasında "yazıcı (typist)" olarak kullanılmıştır.</w:t>
       </w:r>
     </w:p>
     <w:p>
@@ -591,7 +591,7 @@
     </w:p>
     <w:p>
       <w:r>
-        <w:t>Proje geliştirme sürecimizde, uygulamanın akıllı yeteneklerini (e-posta özetleme, duygu analizi) oluşturmak amacıyla Python tabanlı açık kaynaklı NLP modelleri projeye manuel olarak entegre edilmiştir. Kod üretimi için kullanılan YZ asistanlarından (ChatGPT, Claude, vb.) alınan her türlü asenkron Rust mimarisi çıktısı, uygulamanın bellek güvenliği (memory safety) standartlarına ve SQLite ilişkisel veritabanı kısıtlamalarına uygunluk açısından denetlenerek projeye dahil edilmiştir.</w:t>
+        <w:t>Proje geliştirme sürecimizde, uygulamanın akıllı yeteneklerini (e-posta özetleme, duygu analizi) oluşturmak amacıyla Python tabanlı açık kaynaklı NLP modelleri projeye manuel olarak entegre edilmiştir. Kod üretimi için kullanılan YZ asistanlarından (Gemini, Claude, vb.) alınan her türlü asenkron Rust mimarisi çıktısı, uygulamanın bellek güvenliği (memory safety) standartlarına ve SQLite ilişkisel veritabanı kısıtlamalarına uygunluk açısından denetlenerek projeye dahil edilmiştir.</w:t>
       </w:r>
     </w:p>
     <w:p>
@@ -687,7 +687,7 @@
     </w:p>
     <w:p>
       <w:r>
-        <w:t>Yapay zeka çıktıları, özellikle angarya (boilerplate) kodların yazımı ve tekrarlayan CSS/HTML yapılarının kurgulanması gibi işlemlerde doğrudan kullanılmıştır. Ancak;</w:t>
+        <w:t>Yapay zeka çıktıları, yalnızca ekibin kurguladığı sistematiği koda dökmek ve angarya (boilerplate) CSS/HTML yapılarını oluşturmak için kullanılmıştır. Projenin ana omurgası ve kontrolü tamamen geliştirici ekibin elindedir. Özellikle;</w:t>
       </w:r>
     </w:p>
     <w:p>
@@ -716,7 +716,7 @@
     </w:p>
     <w:p>
       <w:r>
-        <w:t>tamamen proje ekibi tarafından uyarlanmış ve manuel olarak yeniden yapılandırılmıştır. YZ, geliştirmeyi hızlandıran bir mentor (Pair Programmer) olarak konumlandırılmıştır.</w:t>
+        <w:t>tamamen proje ekibi tarafından manuel olarak yapılandırılmış ve YZ çıktıları bu katı kurallara uymak zorunda bırakılmıştır. YZ, mimar değil yalnızca geliştirmeyi hızlandıran bir asistan olarak konumlandırılmıştır.</w:t>
       </w:r>
     </w:p>
     <w:p>

</xml_diff>